<commit_message>
Atualiza qualificacao completa de todos os 4 vendedores no contrato Buona Vita
</commit_message>
<xml_diff>
--- a/Contrato_Compromisso_Compra_e_Venda_Buona_Vita_Ipe_da_Mata.docx
+++ b/Contrato_Compromisso_Compra_e_Venda_Buona_Vita_Ipe_da_Mata.docx
@@ -115,6 +115,112 @@
     </w:p>
     <w:p>
       <w:pPr>
+        <w:spacing w:after="120" w:before="0" w:line="276" w:lineRule="auto"/>
+        <w:ind w:left="288"/>
+        <w:jc w:val="both"/>
+        <w:rPr>
+          <w:rFonts w:ascii="Arial" w:eastAsia="Arial" w:hAnsi="Arial" w:cs="Arial"/>
+          <w:b/>
+          <w:bCs/>
+        </w:rPr>
+      </w:pPr>
+      <w:r/>
+      <w:r>
+        <w:rPr>
+          <w:rFonts w:ascii="Arial" w:hAnsi="Arial"/>
+          <w:b/>
+          <w:sz w:val="21"/>
+        </w:rPr>
+        <w:t>1. ADEMIR VENTURINI</w:t>
+      </w:r>
+      <w:r>
+        <w:rPr>
+          <w:rFonts w:ascii="Arial" w:hAnsi="Arial"/>
+          <w:b w:val="0"/>
+          <w:sz w:val="21"/>
+        </w:rPr>
+        <w:t xml:space="preserve">, brasileiro, marceneiro, nascido aos 25 de julho de 1972 na cidade de Jales - SP, filho de Raymundo Venturini e Nair Bonin Venturini, portador da Cédula de Identidade RG nº 24.694.860 SSP/SP, inscrito no CPF/MF sob o nº 133.470.468-62, CNH Registro nº 01418205561 (DETRAN/SP), casado sob o regime da Comunhão Parcial de Bens na vigência da Lei Federal nº 6.515/77 (conforme Certidão de Casamento lavrada no Cartório de Registro Civil das Pessoas Naturais do 1º Subdistrito da Comarca de São José do Rio Preto - SP, Livro B nº 106, fls. 73, termo nº 12.678, celebrado em 15 de janeiro de 1994) com </w:t>
+      </w:r>
+      <w:r>
+        <w:rPr>
+          <w:rFonts w:ascii="Arial" w:hAnsi="Arial"/>
+          <w:b/>
+          <w:sz w:val="21"/>
+        </w:rPr>
+        <w:t>MARILAINE OLIVEIRA SILVA VENTURINI</w:t>
+      </w:r>
+      <w:r>
+        <w:rPr>
+          <w:rFonts w:ascii="Arial" w:hAnsi="Arial"/>
+          <w:b w:val="0"/>
+          <w:sz w:val="21"/>
+        </w:rPr>
+        <w:t>, brasileira, do lar, nascida aos 14 de outubro de 1974 na cidade de São José do Rio Preto - SP, filha de Eusebio Oliveira Silva e Maria Antonia Nunes Silva, portadora da Cédula de Identidade RG nº 25.067.901 SSP/SP, inscrita no CPF/MF sob o nº 121.790.318-66, CNH Registro nº 02130546417 (DETRAN/SP), ambos residentes e domiciliados à Rua Antonio Pirola, nº 123, Residencial Alto das Andorinhas, CEP 15046-231, na cidade de São José do Rio Preto - SP; e</w:t>
+      </w:r>
+    </w:p>
+    <w:p>
+      <w:pPr>
+        <w:spacing w:before="0" w:after="120" w:line="276" w:lineRule="auto"/>
+        <w:ind w:left="288"/>
+        <w:jc w:val="both"/>
+      </w:pPr>
+      <w:r>
+        <w:rPr>
+          <w:rFonts w:ascii="Arial" w:hAnsi="Arial"/>
+          <w:b/>
+          <w:sz w:val="21"/>
+        </w:rPr>
+        <w:t>2. WEBER REGINALDO DOS SANTOS</w:t>
+      </w:r>
+      <w:r>
+        <w:rPr>
+          <w:rFonts w:ascii="Arial" w:hAnsi="Arial"/>
+          <w:b w:val="0"/>
+          <w:sz w:val="21"/>
+        </w:rPr>
+        <w:t xml:space="preserve">, brasileiro, empresário/comerciante, nascido aos 19 de julho de 1976 na cidade de Mauá - SP, filho de José Bonfim dos Santos e Clarice Venturini dos Santos, portador da Cédula de Identidade RG nº 22.806.400-4 SSP/SP e inscrito no CPF/MF sob o nº 151.990.938-19, casado sob o regime da Comunhão Universal de Bens (conforme Escritura Pública de Pacto Antenupcial lavrada perante o 4º Tabelião de Notas da Comarca de São José do Rio Preto - SP, Livro nº 0552, fls. 379, aos 15 de outubro de 2007; e assento de casamento sob Matrícula nº 115261 01 55 2007 3 00006 020 0001701 01 do 2º Oficial de Registro Civil das Pessoas Naturais de São José do Rio Preto - SP, Livro B-Aux nº 6, fls. 20, termo nº 1701, celebrado em 03 de novembro de 2007) com </w:t>
+      </w:r>
+      <w:r>
+        <w:rPr>
+          <w:rFonts w:ascii="Arial" w:hAnsi="Arial"/>
+          <w:b/>
+          <w:sz w:val="21"/>
+        </w:rPr>
+        <w:t>PATRICIA FERNANDA DE MORAES BALDUINO DOS SANTOS</w:t>
+      </w:r>
+      <w:r>
+        <w:rPr>
+          <w:rFonts w:ascii="Arial" w:hAnsi="Arial"/>
+          <w:b w:val="0"/>
+          <w:sz w:val="21"/>
+        </w:rPr>
+        <w:t>, brasileira, comerciante / do lar, nascida aos 06 de junho de 1980 na cidade de São José do Rio Preto - SP, filha de Orlando Balduino e Vera Lucia de Moraes Balduino, portadora da Cédula de Identidade RG nº 30.213.714-2 SSP/SP e inscrita no CPF/MF sob o nº 289.020.208-94, ambos residentes e domiciliados à Rua Direitos Humanos, nº 611, Bairro Residencial Ana Célia, CEP 15045-512, na cidade de São José do Rio Preto - SP.</w:t>
+      </w:r>
+    </w:p>
+    <w:p>
+      <w:pPr>
+        <w:spacing w:before="200" w:after="80"/>
+        <w:rPr>
+          <w:rFonts w:ascii="Arial" w:eastAsia="Arial" w:hAnsi="Arial" w:cs="Arial"/>
+          <w:b/>
+          <w:bCs/>
+          <w:sz w:val="23"/>
+          <w:szCs w:val="23"/>
+        </w:rPr>
+      </w:pPr>
+      <w:r>
+        <w:rPr>
+          <w:rFonts w:ascii="Arial" w:eastAsia="Arial" w:hAnsi="Arial" w:cs="Arial"/>
+          <w:b/>
+          <w:bCs/>
+          <w:sz w:val="23"/>
+          <w:szCs w:val="23"/>
+        </w:rPr>
+        <w:t>B – PROMISSÁRIOS COMPRADORES:</w:t>
+      </w:r>
+    </w:p>
+    <w:p>
+      <w:pPr>
         <w:spacing w:after="40"/>
         <w:jc w:val="center"/>
         <w:rPr>
@@ -129,47 +235,6 @@
           <w:b/>
           <w:bCs/>
         </w:rPr>
-        <w:t>WEBER REGINALDO DOS SANTOS, brasileiro, empresário/comerciante, portador da Cédula de Identidade RG nº 22.806.400-4 SSP/SP e inscrito no CPF/MF sob o nº 151.990.938-19, casado sob o regime de Comunhão Universal de Bens (conforme Escritura Pública de Pacto Antenupcial lavrada perante o 4º Tabelião de Notas de São José do Rio Preto/SP, Livro nº 0552, fls. 379; assento de casamento sob matrícula nº 115261 01 55 2007 3 00006 020 0001701 01 do 2º Registro Civil local) com PATRICIA FERNANDA DE MORAES BALDUINO DOS SANTOS, brasileira, portadora da Cédula de Identidade RG nº 30.213.714-2 SSP/SP e inscrita no CPF/MF sob o nº 289.020.208-94, ambos residentes e domiciliados à Rua Direitos Humanos, nº 611, Bairro Residencial Ana Célia, CEP 15045-512, na cidade de São José do Rio Preto - SP.</w:t>
-      </w:r>
-    </w:p>
-    <w:p>
-      <w:pPr>
-        <w:spacing w:before="200" w:after="80"/>
-        <w:rPr>
-          <w:rFonts w:ascii="Arial" w:eastAsia="Arial" w:hAnsi="Arial" w:cs="Arial"/>
-          <w:b/>
-          <w:bCs/>
-          <w:sz w:val="23"/>
-          <w:szCs w:val="23"/>
-        </w:rPr>
-      </w:pPr>
-      <w:r>
-        <w:rPr>
-          <w:rFonts w:ascii="Arial" w:eastAsia="Arial" w:hAnsi="Arial" w:cs="Arial"/>
-          <w:b/>
-          <w:bCs/>
-          <w:sz w:val="23"/>
-          <w:szCs w:val="23"/>
-        </w:rPr>
-        <w:t>B – PROMISSÁRIOS COMPRADORES:</w:t>
-      </w:r>
-    </w:p>
-    <w:p>
-      <w:pPr>
-        <w:spacing w:after="40"/>
-        <w:jc w:val="center"/>
-        <w:rPr>
-          <w:rFonts w:ascii="Arial" w:eastAsia="Arial" w:hAnsi="Arial" w:cs="Arial"/>
-          <w:b/>
-          <w:bCs/>
-        </w:rPr>
-      </w:pPr>
-      <w:r>
-        <w:rPr>
-          <w:rFonts w:ascii="Arial" w:eastAsia="Arial" w:hAnsi="Arial" w:cs="Arial"/>
-          <w:b/>
-          <w:bCs/>
-        </w:rPr>
         <w:t xml:space="preserve">JOÃO ROBERTO FRESCHI, brasileiro, cirurgião-dentista aposentado, portador da Cédula de Identidade RG nº 6.012.357-6 SSP/SP e inscrito no CPF/MF sob o nº 787.804.468-68, e sua esposa MARIA GENERCI RIGONATO FRESCHI, brasileira, professora aposentada / do lar, portadora da Cédula de Identidade RG nº 12.515.252 SSP/SP (CNH nº 01328033085) e inscrita no CPF/MF sob o nº 045.709.208-45, casados entre si sob o regime de Comunhão Universal de Bens na vigência da Lei nº 6.515/77 (conforme Escritura Pública de Pacto Antenupcial lavrada no Cartório de Registro Civil de Paraíso - SP, Livro nº 58, fls. 167, devidamente registrada sob o nº 3.266 no 1º Oficial de Registro de Imóveis da Comarca de Catanduva - SP), ambos residentes e domiciliados na Avenida Romeu </w:t>
       </w:r>
       <w:proofErr w:type="spellStart"/>
@@ -1833,104 +1898,148 @@
     </w:p>
     <w:p>
       <w:pPr>
-        <w:spacing w:after="40"/>
-        <w:ind w:left="400" w:right="400"/>
+        <w:spacing w:before="240" w:after="40"/>
         <w:jc w:val="center"/>
-        <w:rPr>
-          <w:rFonts w:ascii="Arial" w:eastAsia="Arial" w:hAnsi="Arial" w:cs="Arial"/>
-        </w:rPr>
-      </w:pPr>
-      <w:r>
-        <w:rPr>
-          <w:rFonts w:ascii="Arial" w:eastAsia="Arial" w:hAnsi="Arial" w:cs="Arial"/>
+      </w:pPr>
+      <w:r>
+        <w:rPr>
+          <w:rFonts w:ascii="Arial" w:hAnsi="Arial"/>
         </w:rPr>
         <w:t>__________________________________________________</w:t>
       </w:r>
     </w:p>
     <w:p>
       <w:pPr>
-        <w:spacing w:after="40"/>
-        <w:ind w:left="400" w:right="400"/>
+        <w:spacing w:before="0" w:after="40"/>
         <w:jc w:val="center"/>
-        <w:rPr>
-          <w:rFonts w:ascii="Arial" w:eastAsia="Arial" w:hAnsi="Arial" w:cs="Arial"/>
-          <w:b/>
-          <w:bCs/>
-        </w:rPr>
-      </w:pPr>
-      <w:r>
-        <w:rPr>
-          <w:rFonts w:ascii="Arial" w:eastAsia="Arial" w:hAnsi="Arial" w:cs="Arial"/>
-          <w:b/>
-          <w:bCs/>
+      </w:pPr>
+      <w:r>
+        <w:rPr>
+          <w:rFonts w:ascii="Arial" w:hAnsi="Arial"/>
+          <w:b/>
+        </w:rPr>
+        <w:t>ADEMIR VENTURINI</w:t>
+      </w:r>
+    </w:p>
+    <w:p>
+      <w:pPr>
+        <w:spacing w:before="0" w:after="280"/>
+        <w:jc w:val="center"/>
+      </w:pPr>
+      <w:r>
+        <w:rPr>
+          <w:rFonts w:ascii="Arial" w:hAnsi="Arial"/>
+        </w:rPr>
+        <w:t>CPF: 133.470.468-62</w:t>
+      </w:r>
+    </w:p>
+    <w:p>
+      <w:pPr>
+        <w:spacing w:before="240" w:after="40"/>
+        <w:jc w:val="center"/>
+      </w:pPr>
+      <w:r>
+        <w:rPr>
+          <w:rFonts w:ascii="Arial" w:hAnsi="Arial"/>
+        </w:rPr>
+        <w:t>__________________________________________________</w:t>
+      </w:r>
+    </w:p>
+    <w:p>
+      <w:pPr>
+        <w:spacing w:before="0" w:after="40"/>
+        <w:jc w:val="center"/>
+      </w:pPr>
+      <w:r>
+        <w:rPr>
+          <w:rFonts w:ascii="Arial" w:hAnsi="Arial"/>
+          <w:b/>
+        </w:rPr>
+        <w:t>MARILAINE OLIVEIRA SILVA VENTURINI</w:t>
+      </w:r>
+    </w:p>
+    <w:p>
+      <w:pPr>
+        <w:spacing w:before="0" w:after="280"/>
+        <w:jc w:val="center"/>
+      </w:pPr>
+      <w:r>
+        <w:rPr>
+          <w:rFonts w:ascii="Arial" w:hAnsi="Arial"/>
+        </w:rPr>
+        <w:t>CPF: 121.790.318-66</w:t>
+      </w:r>
+    </w:p>
+    <w:p>
+      <w:pPr>
+        <w:spacing w:before="240" w:after="40"/>
+        <w:jc w:val="center"/>
+      </w:pPr>
+      <w:r>
+        <w:rPr>
+          <w:rFonts w:ascii="Arial" w:hAnsi="Arial"/>
+        </w:rPr>
+        <w:t>__________________________________________________</w:t>
+      </w:r>
+    </w:p>
+    <w:p>
+      <w:pPr>
+        <w:spacing w:before="0" w:after="40"/>
+        <w:jc w:val="center"/>
+      </w:pPr>
+      <w:r>
+        <w:rPr>
+          <w:rFonts w:ascii="Arial" w:hAnsi="Arial"/>
+          <w:b/>
         </w:rPr>
         <w:t>WEBER REGINALDO DOS SANTOS</w:t>
       </w:r>
     </w:p>
     <w:p>
       <w:pPr>
-        <w:spacing w:after="40"/>
-        <w:ind w:left="400" w:right="400"/>
+        <w:spacing w:before="0" w:after="280"/>
         <w:jc w:val="center"/>
-        <w:rPr>
-          <w:rFonts w:ascii="Arial" w:eastAsia="Arial" w:hAnsi="Arial" w:cs="Arial"/>
-        </w:rPr>
-      </w:pPr>
-      <w:r>
-        <w:rPr>
-          <w:rFonts w:ascii="Arial" w:eastAsia="Arial" w:hAnsi="Arial" w:cs="Arial"/>
+      </w:pPr>
+      <w:r>
+        <w:rPr>
+          <w:rFonts w:ascii="Arial" w:hAnsi="Arial"/>
         </w:rPr>
         <w:t>CPF: 151.990.938-19</w:t>
       </w:r>
     </w:p>
     <w:p>
       <w:pPr>
-        <w:spacing w:after="40"/>
-        <w:ind w:left="400" w:right="400"/>
+        <w:spacing w:before="240" w:after="40"/>
         <w:jc w:val="center"/>
-        <w:rPr>
-          <w:rFonts w:ascii="Arial" w:eastAsia="Arial" w:hAnsi="Arial" w:cs="Arial"/>
-        </w:rPr>
-      </w:pPr>
-      <w:r>
-        <w:rPr>
-          <w:rFonts w:ascii="Arial" w:eastAsia="Arial" w:hAnsi="Arial" w:cs="Arial"/>
+      </w:pPr>
+      <w:r>
+        <w:rPr>
+          <w:rFonts w:ascii="Arial" w:hAnsi="Arial"/>
         </w:rPr>
         <w:t>__________________________________________________</w:t>
       </w:r>
     </w:p>
     <w:p>
       <w:pPr>
-        <w:spacing w:after="40"/>
-        <w:ind w:left="400" w:right="400"/>
+        <w:spacing w:before="0" w:after="40"/>
         <w:jc w:val="center"/>
-        <w:rPr>
-          <w:rFonts w:ascii="Arial" w:eastAsia="Arial" w:hAnsi="Arial" w:cs="Arial"/>
-          <w:b/>
-          <w:bCs/>
-        </w:rPr>
-      </w:pPr>
-      <w:r>
-        <w:rPr>
-          <w:rFonts w:ascii="Arial" w:eastAsia="Arial" w:hAnsi="Arial" w:cs="Arial"/>
-          <w:b/>
-          <w:bCs/>
+      </w:pPr>
+      <w:r>
+        <w:rPr>
+          <w:rFonts w:ascii="Arial" w:hAnsi="Arial"/>
+          <w:b/>
         </w:rPr>
         <w:t>PATRICIA FERNANDA DE MORAES BALDUINO DOS SANTOS</w:t>
       </w:r>
     </w:p>
     <w:p>
       <w:pPr>
-        <w:spacing w:after="40"/>
-        <w:ind w:left="400" w:right="400"/>
+        <w:spacing w:before="0" w:after="280"/>
         <w:jc w:val="center"/>
-        <w:rPr>
-          <w:rFonts w:ascii="Arial" w:eastAsia="Arial" w:hAnsi="Arial" w:cs="Arial"/>
-        </w:rPr>
-      </w:pPr>
-      <w:r>
-        <w:rPr>
-          <w:rFonts w:ascii="Arial" w:eastAsia="Arial" w:hAnsi="Arial" w:cs="Arial"/>
+      </w:pPr>
+      <w:r>
+        <w:rPr>
+          <w:rFonts w:ascii="Arial" w:hAnsi="Arial"/>
         </w:rPr>
         <w:t>CPF: 289.020.208-94</w:t>
       </w:r>

</xml_diff>

<commit_message>
Contrato Buona Vita: prazo 15 dias uteis e comissao R$ 100 mil na venda a vista
</commit_message>
<xml_diff>
--- a/Contrato_Compromisso_Compra_e_Venda_Buona_Vita_Ipe_da_Mata.docx
+++ b/Contrato_Compromisso_Compra_e_Venda_Buona_Vita_Ipe_da_Mata.docx
@@ -384,7 +384,6 @@
           <w:sz w:val="23"/>
           <w:szCs w:val="23"/>
         </w:rPr>
-        <w:lastRenderedPageBreak/>
         <w:t>CLÁUSULA SEGUNDA – DO PREÇO E DA FORMA DE PAGAMENTO</w:t>
       </w:r>
     </w:p>
@@ -570,7 +569,7 @@
           <w:b/>
           <w:sz w:val="21"/>
         </w:rPr>
-        <w:t xml:space="preserve">- Parágrafo Terceiro (Do Prazo de 20 Dias Úteis para Venda do Apartamento e Consolidação da Permuta): </w:t>
+        <w:t xml:space="preserve">- Parágrafo Terceiro (Do Prazo de 15 Dias Úteis para Venda do Apartamento e Consolidação da Permuta): </w:t>
       </w:r>
       <w:r>
         <w:rPr>
@@ -602,7 +601,7 @@
           <w:b/>
           <w:sz w:val="21"/>
         </w:rPr>
-        <w:t>20 (vinte) dias úteis</w:t>
+        <w:t>15 (quinze) dias úteis</w:t>
       </w:r>
       <w:r>
         <w:rPr>
@@ -626,7 +625,7 @@
           <w:b w:val="0"/>
           <w:sz w:val="21"/>
         </w:rPr>
-        <w:t xml:space="preserve"> perante terceiros adquirentes no mercado imobiliário. Caso a referida venda a terceiros não venha a ser efetivamente concluída e formalizada dentro do mencionado prazo estipulado de 20 (vinte) dias úteis, a dação em pagamento / permuta imobiliária se consolidará de pleno direito e em caráter definitivo, irrevogável e irretratável, passando o referido apartamento a ser de legítima, plena e exclusiva propriedade dos </w:t>
+        <w:t xml:space="preserve"> perante terceiros adquirentes no mercado imobiliário. Caso a referida venda a terceiros não venha a ser efetivamente concluída e formalizada dentro do mencionado prazo estipulado de 15 (quinze) dias úteis, a dação em pagamento / permuta imobiliária se consolidará de pleno direito e em caráter definitivo, irrevogável e irretratável, passando o referido apartamento a ser de legítima, plena e exclusiva propriedade dos </w:t>
       </w:r>
       <w:r>
         <w:rPr>
@@ -713,7 +712,7 @@
           <w:b w:val="0"/>
           <w:sz w:val="21"/>
         </w:rPr>
-        <w:t xml:space="preserve"> concretizarem com êxito a venda do Apartamento nº 74 do Edifício Ipê da Mata a terceiros dentro do aludido prazo de 20 (vinte) dias úteis, as partes estipulam que vigorarão de forma imediata e automática as seguintes condições especiais:</w:t>
+        <w:t xml:space="preserve"> concretizarem com êxito a venda do Apartamento nº 74 do Edifício Ipê da Mata a terceiros dentro do aludido prazo de 15 (quinze) dias úteis, as partes estipulam que vigorarão de forma imediata e automática as seguintes condições especiais:</w:t>
         <w:br/>
       </w:r>
       <w:r>
@@ -875,7 +874,6 @@
         <w:rPr>
           <w:rFonts w:ascii="Arial" w:eastAsia="Arial" w:hAnsi="Arial" w:cs="Arial"/>
         </w:rPr>
-        <w:lastRenderedPageBreak/>
         <w:t>até 15 (quinze) dias contados da assinatura deste contrato, as certidões de praxe indispensáveis à comprovação da idoneidade patrimonial e plena higidez do negócio:</w:t>
       </w:r>
     </w:p>
@@ -1256,7 +1254,7 @@
           <w:b w:val="0"/>
           <w:sz w:val="21"/>
         </w:rPr>
-        <w:t xml:space="preserve">Conforme estabelecido no Parágrafo Quarto da Cláusula Segunda, caso os PROMISSÁRIOS COMPRADORES concretizem a venda do apartamento a terceiros dentro do prazo de 20 (vinte) dias úteis e o negócio da residência no Condomínio Buona Vita seja liquidado pelo valor de R$ 2.250.000,00 à vista, as obrigações dos PROMITENTES VENDEDORES estipuladas no Parágrafo Segundo desta Cláusula (instalação dos 05 aparelhos de ar-condicionado e do Cassette de 60.000 BTUs) </w:t>
+        <w:t xml:space="preserve">Conforme estabelecido no Parágrafo Quarto da Cláusula Segunda, caso os PROMISSÁRIOS COMPRADORES concretizem a venda do apartamento a terceiros dentro do prazo de 15 (quinze) dias úteis e o negócio da residência no Condomínio Buona Vita seja liquidado pelo valor de R$ 2.250.000,00 à vista, as obrigações dos PROMITENTES VENDEDORES estipuladas no Parágrafo Segundo desta Cláusula (instalação dos 05 aparelhos de ar-condicionado e do Cassette de 60.000 BTUs) </w:t>
       </w:r>
       <w:r>
         <w:rPr>
@@ -1317,7 +1315,6 @@
         <w:rPr>
           <w:rFonts w:ascii="Arial" w:eastAsia="Arial" w:hAnsi="Arial" w:cs="Arial"/>
         </w:rPr>
-        <w:lastRenderedPageBreak/>
         <w:t>e liberação do financiamento, este instrumento conferirá expressamente o direito de propor Ação de Adjudicação Compulsória, servindo como título executivo hábil nos moldes do art. 22 do Decreto-Lei nº 58/1937, da Lei nº 649/1949, do art. 1.418 do Código Civil e das normas processuais civis vigentes.</w:t>
       </w:r>
     </w:p>
@@ -1392,7 +1389,7 @@
           <w:b/>
           <w:sz w:val="21"/>
         </w:rPr>
-        <w:t>decorrido o prazo de 20 (vinte) dias úteis previsto no Parágrafo Terceiro da Cláusula Segunda sem a concretização da venda a terceiros, consolidando-se a permuta</w:t>
+        <w:t>decorrido o prazo de 15 (quinze) dias úteis previsto no Parágrafo Terceiro da Cláusula Segunda sem a concretização da venda a terceiros, consolidando-se a permuta</w:t>
       </w:r>
       <w:r>
         <w:rPr>
@@ -1557,6 +1554,61 @@
     </w:p>
     <w:p>
       <w:pPr>
+        <w:spacing w:after="120"/>
+        <w:ind w:left="288"/>
+        <w:jc w:val="both"/>
+      </w:pPr>
+      <w:r>
+        <w:rPr>
+          <w:rFonts w:ascii="Arial" w:hAnsi="Arial"/>
+          <w:b/>
+          <w:sz w:val="21"/>
+        </w:rPr>
+        <w:t xml:space="preserve">- Parágrafo Único (Comissão na Hipótese de Venda à Vista): </w:t>
+      </w:r>
+      <w:r>
+        <w:rPr>
+          <w:rFonts w:ascii="Arial" w:hAnsi="Arial"/>
+          <w:b w:val="0"/>
+          <w:sz w:val="21"/>
+        </w:rPr>
+        <w:t xml:space="preserve">Ocorrendo a hipótese prevista no Parágrafo Quarto da Cláusula Segunda, ou seja, concretizada a venda do Apartamento nº 74 do Edifício Ipê da Mata a terceiros dentro do prazo de 15 (quinze) dias úteis e repactuado o negócio para pagamento à vista no valor de R$ 2.250.000,00, a comissão de corretagem devida ao corretor </w:t>
+      </w:r>
+      <w:r>
+        <w:rPr>
+          <w:rFonts w:ascii="Arial" w:hAnsi="Arial"/>
+          <w:b/>
+          <w:sz w:val="21"/>
+        </w:rPr>
+        <w:t>VALTEIR DE OLIVEIRA – CRECI/SP 214072F</w:t>
+      </w:r>
+      <w:r>
+        <w:rPr>
+          <w:rFonts w:ascii="Arial" w:hAnsi="Arial"/>
+          <w:b w:val="0"/>
+          <w:sz w:val="21"/>
+        </w:rPr>
+        <w:t xml:space="preserve"> passará a ser fixa no valor de </w:t>
+      </w:r>
+      <w:r>
+        <w:rPr>
+          <w:rFonts w:ascii="Arial" w:hAnsi="Arial"/>
+          <w:b/>
+          <w:sz w:val="21"/>
+        </w:rPr>
+        <w:t>R$ 100.000,00 (cem mil reais)</w:t>
+      </w:r>
+      <w:r>
+        <w:rPr>
+          <w:rFonts w:ascii="Arial" w:hAnsi="Arial"/>
+          <w:b w:val="0"/>
+          <w:sz w:val="21"/>
+        </w:rPr>
+        <w:t>, em substituição ao critério percentual previsto no caput desta Cláusula, mantida a mesma responsabilidade pelo pagamento, devendo ser quitada na data da liquidação do saldo à vista, mediante transferência bancária (PIX/TED) para a Chave PIX CNPJ 50.185.716/0001-89 (Valteir Imóveis - Banco C6 S.A.).</w:t>
+      </w:r>
+    </w:p>
+    <w:p>
+      <w:pPr>
         <w:spacing w:before="200" w:after="80"/>
         <w:ind w:left="400" w:right="400"/>
         <w:rPr>
@@ -1591,7 +1643,6 @@
         <w:rPr>
           <w:rFonts w:ascii="Arial" w:eastAsia="Arial" w:hAnsi="Arial" w:cs="Arial"/>
         </w:rPr>
-        <w:lastRenderedPageBreak/>
         <w:t>Todos os tributos municipais (IPTU), contribuições condominiais ordinárias e extraordinárias, taxas associativas e despesas de consumo de água (SEMAE), energia elétrica (CPFL) e gás incidentes sobre cada um dos imóveis correrão por conta exclusiva dos seus respectivos transmitentes até a data da imissão na posse (entrega das chaves), ocasião em que passarão a ser de inteira responsabilidade dos respectivos adquirentes.</w:t>
       </w:r>
     </w:p>
@@ -1745,7 +1796,6 @@
         <w:rPr>
           <w:rFonts w:ascii="Arial" w:eastAsia="Arial" w:hAnsi="Arial" w:cs="Arial"/>
         </w:rPr>
-        <w:lastRenderedPageBreak/>
         <w:t xml:space="preserve">Compulsória em face do Espólio, nos termos dos </w:t>
       </w:r>
       <w:proofErr w:type="spellStart"/>
@@ -2326,7 +2376,6 @@
           <w:b/>
           <w:bCs/>
         </w:rPr>
-        <w:lastRenderedPageBreak/>
         <w:t>Na qualidade de filhos e herdeiros necessários dos PROMISSÁRIOS COMPRADORES JOÃO ROBERTO FRESCHI e MARIA GENERCI RIGONATO FRESCHI, declaramos ter pleno e irrevogável conhecimento dos termos e condições do presente negócio imobiliário e da dação em pagamento / permuta do Apartamento nº 74 do Condomínio Ipê da Mata em favor dos PROMITENTES VENDEDORES, ratificando integralmente todas as disposições da Cláusula Décima Segunda e comprometendo-nos a não opor qualquer resistência à lavratura da escritura pública definitiva ou ao cumprimento de alvará judicial:</w:t>
       </w:r>
     </w:p>

</xml_diff>

<commit_message>
Contrato Buona Vita: posse e chaves apos assinatura do financiamento
</commit_message>
<xml_diff>
--- a/Contrato_Compromisso_Compra_e_Venda_Buona_Vita_Ipe_da_Mata.docx
+++ b/Contrato_Compromisso_Compra_e_Venda_Buona_Vita_Ipe_da_Mata.docx
@@ -540,22 +540,10 @@
         <w:rPr>
           <w:rFonts w:ascii="Arial" w:eastAsia="Arial" w:hAnsi="Arial" w:cs="Arial"/>
         </w:rPr>
-        <w:t xml:space="preserve">Parágrafo Segundo (Posse e Entrega Simultânea das Chaves): As partes contratantes convencionam que a entrega das chaves e a respectiva imissão na posse de ambos os imóveis (tanto da residência no Condomínio Parque </w:t>
+        <w:t>Parágrafo Segundo (Posse e Entrega Simultânea das Chaves): As partes contratantes convencionam que a entrega das chaves e a respectiva imissão na posse de ambos os imóveis (tanto da residência no Condomínio Parque Buona Vita quanto do apartamento nº 74 no Edifício Ipê da Mata) ocorrerão de forma simultânea somente após a assinatura do contrato de financiamento imobiliário referente à 3ª Parcela (item 3 desta Cláusula) perante a Instituição Financeira escolhida pelos PROMISSÁRIOS COMPRADORES, mediante a constatação do adimplemento das obrigações pecuniárias previstas nos itens 1 e 2 desta Cláusula. Na hipótese de conversão do negócio para pagamento à vista, prevista no Parágrafo Quarto desta Cláusula, a entrega das chaves e a imissão na posse da residência ocorrerão após a quitação integral do saldo à vista.</w:t>
       </w:r>
       <w:proofErr w:type="spellStart"/>
-      <w:r>
-        <w:rPr>
-          <w:rFonts w:ascii="Arial" w:eastAsia="Arial" w:hAnsi="Arial" w:cs="Arial"/>
-        </w:rPr>
-        <w:t>Buona</w:t>
-      </w:r>
       <w:proofErr w:type="spellEnd"/>
-      <w:r>
-        <w:rPr>
-          <w:rFonts w:ascii="Arial" w:eastAsia="Arial" w:hAnsi="Arial" w:cs="Arial"/>
-        </w:rPr>
-        <w:t xml:space="preserve"> Vita quanto do apartamento nº 74 no Edifício Ipê da Mata) ocorrerão de forma simultânea no prazo de até 60 (sessenta) dias a contar da assinatura deste contrato, mediante a constatação do adimplemento das obrigações pecuniárias iniciais.</w:t>
-      </w:r>
     </w:p>
     <w:p>
       <w:pPr>

</xml_diff>

<commit_message>
Contrato Buona Vita: corretor providencia as certidoes
</commit_message>
<xml_diff>
--- a/Contrato_Compromisso_Compra_e_Venda_Buona_Vita_Ipe_da_Mata.docx
+++ b/Contrato_Compromisso_Compra_e_Venda_Buona_Vita_Ipe_da_Mata.docx
@@ -856,13 +856,7 @@
         <w:rPr>
           <w:rFonts w:ascii="Arial" w:eastAsia="Arial" w:hAnsi="Arial" w:cs="Arial"/>
         </w:rPr>
-        <w:t xml:space="preserve">Os PROMITENTES VENDEDORES e os PROMISSÁRIOS COMPRADORES (em relação ao imóvel dado em permuta) obrigam-se reciprocamente a apresentar, no prazo improrrogável de </w:t>
-      </w:r>
-      <w:r>
-        <w:rPr>
-          <w:rFonts w:ascii="Arial" w:eastAsia="Arial" w:hAnsi="Arial" w:cs="Arial"/>
-        </w:rPr>
-        <w:t>até 15 (quinze) dias contados da assinatura deste contrato, as certidões de praxe indispensáveis à comprovação da idoneidade patrimonial e plena higidez do negócio:</w:t>
+        <w:t>As certidões de praxe indispensáveis à comprovação da idoneidade patrimonial e plena higidez do negócio, relativas aos PROMITENTES VENDEDORES, aos PROMISSÁRIOS COMPRADORES e a ambos os imóveis transacionados (inclusive o imóvel dado em permuta), serão providenciadas pelo corretor de imóveis intermediador VALTEIR DE OLIVEIRA – CRECI/SP 214072F, no prazo improrrogável de até 15 (quinze) dias contados da assinatura deste contrato, obrigando-se os PROMITENTES VENDEDORES e os PROMISSÁRIOS COMPRADORES a fornecer-lhe, de imediato, todos os documentos, dados pessoais e autorizações necessários à sua obtenção, compreendendo as seguintes certidões:</w:t>
       </w:r>
     </w:p>
     <w:p>

</xml_diff>

<commit_message>
Contrato Buona Vita: equipamentos do apto Ipe da Mata e instalacao dos ares apos 2a parcela
</commit_message>
<xml_diff>
--- a/Contrato_Compromisso_Compra_e_Venda_Buona_Vita_Ipe_da_Mata.docx
+++ b/Contrato_Compromisso_Compra_e_Venda_Buona_Vita_Ipe_da_Mata.docx
@@ -701,7 +701,20 @@
           <w:sz w:val="21"/>
         </w:rPr>
         <w:t xml:space="preserve"> concretizarem com êxito a venda do Apartamento nº 74 do Edifício Ipê da Mata a terceiros dentro do aludido prazo de 15 (quinze) dias úteis, as partes estipulam que vigorarão de forma imediata e automática as seguintes condições especiais:</w:t>
-        <w:br/>
+      </w:r>
+    </w:p>
+    <w:p>
+      <w:pPr>
+        <w:spacing w:before="0" w:after="120" w:line="276" w:lineRule="auto"/>
+        <w:ind w:left="288"/>
+        <w:jc w:val="both"/>
+      </w:pPr>
+      <w:r>
+        <w:rPr>
+          <w:rFonts w:ascii="Arial" w:hAnsi="Arial"/>
+          <w:b w:val="0"/>
+          <w:sz w:val="21"/>
+        </w:rPr>
       </w:r>
       <w:r>
         <w:rPr>
@@ -726,7 +739,20 @@
           <w:sz w:val="21"/>
         </w:rPr>
         <w:t>;</w:t>
-        <w:br/>
+      </w:r>
+    </w:p>
+    <w:p>
+      <w:pPr>
+        <w:spacing w:before="0" w:after="120" w:line="276" w:lineRule="auto"/>
+        <w:ind w:left="288"/>
+        <w:jc w:val="both"/>
+      </w:pPr>
+      <w:r>
+        <w:rPr>
+          <w:rFonts w:ascii="Arial" w:hAnsi="Arial"/>
+          <w:b w:val="0"/>
+          <w:sz w:val="21"/>
+        </w:rPr>
       </w:r>
       <w:r>
         <w:rPr>
@@ -767,7 +793,20 @@
           <w:sz w:val="21"/>
         </w:rPr>
         <w:t xml:space="preserve"> na data da formalização da escritura/contrato de venda do apartamento a terceiros e correspondente liberação financeira dos recursos;</w:t>
-        <w:br/>
+      </w:r>
+    </w:p>
+    <w:p>
+      <w:pPr>
+        <w:spacing w:before="0" w:after="120" w:line="276" w:lineRule="auto"/>
+        <w:ind w:left="288"/>
+        <w:jc w:val="both"/>
+      </w:pPr>
+      <w:r>
+        <w:rPr>
+          <w:rFonts w:ascii="Arial" w:hAnsi="Arial"/>
+          <w:b w:val="0"/>
+          <w:sz w:val="21"/>
+        </w:rPr>
       </w:r>
       <w:r>
         <w:rPr>
@@ -1036,22 +1075,37 @@
           <w:rFonts w:ascii="Arial" w:eastAsia="Arial" w:hAnsi="Arial" w:cs="Arial"/>
         </w:rPr>
       </w:pPr>
-      <w:r/>
-      <w:r>
-        <w:rPr>
-          <w:rFonts w:ascii="Arial" w:hAnsi="Arial"/>
-          <w:b/>
-          <w:sz w:val="21"/>
-        </w:rPr>
-        <w:t xml:space="preserve">- Parágrafo Primeiro (Equipamentos no Apartamento Ipê da Mata - Permuta): </w:t>
-      </w:r>
-      <w:r>
-        <w:rPr>
-          <w:rFonts w:ascii="Arial" w:hAnsi="Arial"/>
-          <w:b w:val="0"/>
-          <w:sz w:val="21"/>
-        </w:rPr>
-        <w:t xml:space="preserve">Na hipótese de consolidação da permuta tratada na Cláusula Segunda deste contrato, fica expressamente convencionado que permanecerão instalados e serão entregues pelos PROMISSÁRIOS COMPRADORES no Apartamento nº 74 do Condomínio Edifício Ipê da Mata o total de </w:t>
+      <w:r>
+        <w:rPr>
+          <w:rFonts w:ascii="Arial" w:hAnsi="Arial"/>
+          <w:b/>
+          <w:sz w:val="21"/>
+        </w:rPr>
+        <w:t xml:space="preserve">- Parágrafo Primeiro (Equipamentos que Permanecerão no Apartamento do Edifício Ipê da Mata - Permuta): </w:t>
+      </w:r>
+      <w:r>
+        <w:rPr>
+          <w:rFonts w:ascii="Arial" w:hAnsi="Arial"/>
+          <w:b w:val="0"/>
+          <w:sz w:val="21"/>
+        </w:rPr>
+        <w:t xml:space="preserve">Na hipótese de consolidação da permuta tratada na Cláusula Segunda deste contrato, fica expressamente convencionado que permanecerão instalados e serão entregues pelos PROMISSÁRIOS COMPRADORES no </w:t>
+      </w:r>
+      <w:r>
+        <w:rPr>
+          <w:rFonts w:ascii="Arial" w:hAnsi="Arial"/>
+          <w:b/>
+          <w:sz w:val="21"/>
+        </w:rPr>
+        <w:t>Apartamento nº 74 do Edifício Ipê da Mata</w:t>
+      </w:r>
+      <w:r>
+        <w:rPr>
+          <w:rFonts w:ascii="Arial" w:hAnsi="Arial"/>
+          <w:b w:val="0"/>
+          <w:sz w:val="21"/>
+        </w:rPr>
+        <w:t xml:space="preserve">, sem qualquer custo adicional aos PROMITENTES VENDEDORES, os seguintes </w:t>
       </w:r>
       <w:r>
         <w:rPr>
@@ -1067,19 +1121,93 @@
           <w:b w:val="0"/>
           <w:sz w:val="21"/>
         </w:rPr>
-        <w:t xml:space="preserve"> no estado de conservação e perfeito funcionamento em que se encontram, com todas as suas tubulações, fiações, condensadoras, evaporadoras e respectivos controles remotos, os quais são transferidos aos PROMITENTES VENDEDORES sem qualquer custo adicional.</w:t>
-      </w:r>
-    </w:p>
-    <w:p>
-      <w:pPr>
-        <w:spacing w:after="120"/>
-        <w:ind w:left="400" w:right="400"/>
-        <w:jc w:val="both"/>
-        <w:rPr>
-          <w:rFonts w:ascii="Arial" w:eastAsia="Arial" w:hAnsi="Arial" w:cs="Arial"/>
-        </w:rPr>
-      </w:pPr>
-      <w:r/>
+        <w:t>, no estado de conservação e perfeito funcionamento em que se encontram, com todas as suas tubulações, fiações, condensadoras, evaporadoras e respectivos controles remotos:</w:t>
+      </w:r>
+    </w:p>
+    <w:p>
+      <w:pPr>
+        <w:spacing w:after="120"/>
+        <w:ind w:left="400" w:right="400"/>
+        <w:jc w:val="both"/>
+        <w:rPr>
+          <w:rFonts w:ascii="Arial" w:eastAsia="Arial" w:hAnsi="Arial" w:cs="Arial"/>
+        </w:rPr>
+      </w:pPr>
+      <w:r>
+        <w:rPr>
+          <w:rFonts w:ascii="Arial" w:hAnsi="Arial"/>
+          <w:b w:val="0"/>
+          <w:sz w:val="21"/>
+        </w:rPr>
+      </w:r>
+      <w:r>
+        <w:rPr>
+          <w:rFonts w:ascii="Arial" w:hAnsi="Arial"/>
+          <w:b/>
+          <w:sz w:val="21"/>
+        </w:rPr>
+        <w:t>I. 03 (três) aparelhos de ar-condicionado com capacidade de 12.000 BTUs;</w:t>
+      </w:r>
+    </w:p>
+    <w:p>
+      <w:pPr>
+        <w:spacing w:after="120"/>
+        <w:ind w:left="400" w:right="400"/>
+        <w:jc w:val="both"/>
+        <w:rPr>
+          <w:rFonts w:ascii="Arial" w:eastAsia="Arial" w:hAnsi="Arial" w:cs="Arial"/>
+        </w:rPr>
+      </w:pPr>
+      <w:r>
+        <w:rPr>
+          <w:rFonts w:ascii="Arial" w:hAnsi="Arial"/>
+          <w:b/>
+          <w:sz w:val="21"/>
+        </w:rPr>
+      </w:r>
+      <w:r>
+        <w:rPr>
+          <w:rFonts w:ascii="Arial" w:hAnsi="Arial"/>
+          <w:b/>
+          <w:sz w:val="21"/>
+        </w:rPr>
+        <w:t>II. 01 (um) aparelho de ar-condicionado com capacidade de 18.000 BTUs;</w:t>
+      </w:r>
+    </w:p>
+    <w:p>
+      <w:pPr>
+        <w:spacing w:after="120"/>
+        <w:ind w:left="400" w:right="400"/>
+        <w:jc w:val="both"/>
+        <w:rPr>
+          <w:rFonts w:ascii="Arial" w:eastAsia="Arial" w:hAnsi="Arial" w:cs="Arial"/>
+        </w:rPr>
+      </w:pPr>
+      <w:r>
+        <w:rPr>
+          <w:rFonts w:ascii="Arial" w:hAnsi="Arial"/>
+          <w:b/>
+          <w:sz w:val="21"/>
+        </w:rPr>
+      </w:r>
+      <w:r>
+        <w:rPr>
+          <w:rFonts w:ascii="Arial" w:hAnsi="Arial"/>
+          <w:b/>
+          <w:sz w:val="21"/>
+        </w:rPr>
+        <w:t>III. 01 (um) aparelho de ar-condicionado com capacidade de 24.000 BTUs.</w:t>
+      </w:r>
+    </w:p>
+    <w:p>
+      <w:pPr>
+        <w:spacing w:after="120"/>
+        <w:ind w:left="400" w:right="400"/>
+        <w:jc w:val="both"/>
+        <w:rPr>
+          <w:rFonts w:ascii="Arial" w:eastAsia="Arial" w:hAnsi="Arial" w:cs="Arial"/>
+        </w:rPr>
+      </w:pPr>
       <w:r>
         <w:rPr>
           <w:rFonts w:ascii="Arial" w:hAnsi="Arial"/>
@@ -1094,59 +1222,57 @@
           <w:b w:val="0"/>
           <w:sz w:val="21"/>
         </w:rPr>
-        <w:t xml:space="preserve">Ressalvada a hipótese de venda à vista tratada no Parágrafo Quarto da Cláusula Segunda, os PROMITENTES VENDEDORES assumem a responsabilidade e obrigação de adquirir, fornecer e instalar, por sua conta e ônus exclusivo, na residência do Condomínio Parque Buona Vita, o total de </w:t>
-      </w:r>
-      <w:r>
-        <w:rPr>
-          <w:rFonts w:ascii="Arial" w:hAnsi="Arial"/>
-          <w:b/>
-          <w:sz w:val="21"/>
-        </w:rPr>
-        <w:t>05 (cinco) aparelhos de ar-condicionado</w:t>
-      </w:r>
-      <w:r>
-        <w:rPr>
-          <w:rFonts w:ascii="Arial" w:hAnsi="Arial"/>
-          <w:b w:val="0"/>
-          <w:sz w:val="21"/>
-        </w:rPr>
-        <w:t>, novos e em perfeito estado de funcionamento, rigorosamente nas seguintes potências e especificações técnicas:</w:t>
-        <w:br/>
-      </w:r>
-      <w:r>
-        <w:rPr>
-          <w:rFonts w:ascii="Arial" w:hAnsi="Arial"/>
-          <w:b/>
-          <w:sz w:val="21"/>
-        </w:rPr>
-        <w:t>I. 03 (três) aparelhos de ar-condicionado com capacidade de 12.000 BTUs;</w:t>
-        <w:br/>
-      </w:r>
-      <w:r>
-        <w:rPr>
-          <w:rFonts w:ascii="Arial" w:hAnsi="Arial"/>
-          <w:b/>
-          <w:sz w:val="21"/>
-        </w:rPr>
-        <w:t>II. 01 (um) aparelho de ar-condicionado com capacidade de 18.000 BTUs;</w:t>
-        <w:br/>
-      </w:r>
-      <w:r>
-        <w:rPr>
-          <w:rFonts w:ascii="Arial" w:hAnsi="Arial"/>
-          <w:b/>
-          <w:sz w:val="21"/>
-        </w:rPr>
-        <w:t>III. 01 (um) aparelho de ar-condicionado com capacidade de 24.000 BTUs;</w:t>
-        <w:br/>
-      </w:r>
-      <w:r>
-        <w:rPr>
-          <w:rFonts w:ascii="Arial" w:hAnsi="Arial"/>
-          <w:b/>
-          <w:sz w:val="21"/>
-        </w:rPr>
-        <w:t xml:space="preserve">IV. ALÉM de 01 (um) aparelho de ar-condicionado modelo Cassette com capacidade de 60.000 BTUs, </w:t>
+        <w:t>Em contrapartida aos equipamentos que permanecerão no apartamento, descritos no Parágrafo Primeiro, e ressalvada a hipótese de venda à vista tratada no Parágrafo Quarto da Cláusula Segunda, os PROMITENTES VENDEDORES assumem a responsabilidade e obrigação de adquirir, fornecer e instalar, por sua conta e ônus exclusivo, na residência do Condomínio Parque Buona Vita:</w:t>
+      </w:r>
+    </w:p>
+    <w:p>
+      <w:pPr>
+        <w:spacing w:after="120"/>
+        <w:ind w:left="400" w:right="400"/>
+        <w:jc w:val="both"/>
+        <w:rPr>
+          <w:rFonts w:ascii="Arial" w:eastAsia="Arial" w:hAnsi="Arial" w:cs="Arial"/>
+        </w:rPr>
+      </w:pPr>
+      <w:r>
+        <w:rPr>
+          <w:rFonts w:ascii="Arial" w:hAnsi="Arial"/>
+          <w:b w:val="0"/>
+          <w:sz w:val="21"/>
+        </w:rPr>
+      </w:r>
+      <w:r>
+        <w:rPr>
+          <w:rFonts w:ascii="Arial" w:hAnsi="Arial"/>
+          <w:b/>
+          <w:sz w:val="21"/>
+        </w:rPr>
+        <w:t>I. 05 (cinco) aparelhos de ar-condicionado novos, nas mesmas potências dos equipamentos que permanecerão no apartamento (03 de 12.000 BTUs, 01 de 18.000 BTUs e 01 de 24.000 BTUs);</w:t>
+      </w:r>
+    </w:p>
+    <w:p>
+      <w:pPr>
+        <w:spacing w:after="120"/>
+        <w:ind w:left="400" w:right="400"/>
+        <w:jc w:val="both"/>
+        <w:rPr>
+          <w:rFonts w:ascii="Arial" w:eastAsia="Arial" w:hAnsi="Arial" w:cs="Arial"/>
+        </w:rPr>
+      </w:pPr>
+      <w:r>
+        <w:rPr>
+          <w:rFonts w:ascii="Arial" w:hAnsi="Arial"/>
+          <w:b/>
+          <w:sz w:val="21"/>
+        </w:rPr>
+      </w:r>
+      <w:r>
+        <w:rPr>
+          <w:rFonts w:ascii="Arial" w:hAnsi="Arial"/>
+          <w:b/>
+          <w:sz w:val="21"/>
+        </w:rPr>
+        <w:t xml:space="preserve">II. ALÉM de 01 (um) aparelho de ar-condicionado modelo Cassette com capacidade de 60.000 BTUs, </w:t>
       </w:r>
       <w:r>
         <w:rPr>
@@ -1155,6 +1281,55 @@
           <w:sz w:val="21"/>
         </w:rPr>
         <w:t>a ser devidamente instalado, embutido no teto e testado no ambiente do Espaço Gourmet.</w:t>
+      </w:r>
+    </w:p>
+    <w:p>
+      <w:pPr>
+        <w:spacing w:after="120"/>
+        <w:ind w:left="400" w:right="400"/>
+        <w:jc w:val="both"/>
+        <w:rPr>
+          <w:rFonts w:ascii="Arial" w:eastAsia="Arial" w:hAnsi="Arial" w:cs="Arial"/>
+        </w:rPr>
+      </w:pPr>
+      <w:r>
+        <w:rPr>
+          <w:rFonts w:ascii="Arial" w:hAnsi="Arial"/>
+          <w:b w:val="0"/>
+          <w:sz w:val="21"/>
+        </w:rPr>
+      </w:r>
+      <w:r>
+        <w:rPr>
+          <w:rFonts w:ascii="Arial" w:hAnsi="Arial"/>
+          <w:b/>
+          <w:sz w:val="21"/>
+        </w:rPr>
+        <w:t xml:space="preserve">Prazo de Instalação: </w:t>
+      </w:r>
+      <w:r>
+        <w:rPr>
+          <w:rFonts w:ascii="Arial" w:hAnsi="Arial"/>
+          <w:b w:val="0"/>
+          <w:sz w:val="21"/>
+        </w:rPr>
+        <w:t xml:space="preserve">A instalação de todos os aparelhos de ar-condicionado previstos neste Parágrafo será realizada pelos PROMITENTES VENDEDORES </w:t>
+      </w:r>
+      <w:r>
+        <w:rPr>
+          <w:rFonts w:ascii="Arial" w:hAnsi="Arial"/>
+          <w:b/>
+          <w:sz w:val="21"/>
+        </w:rPr>
+        <w:t>somente após o efetivo recebimento da 2ª Parcela (R$ 200.000,00 – item 2 da Cláusula Segunda)</w:t>
+      </w:r>
+      <w:r>
+        <w:rPr>
+          <w:rFonts w:ascii="Arial" w:hAnsi="Arial"/>
+          <w:b w:val="0"/>
+          <w:sz w:val="21"/>
+        </w:rPr>
+        <w:t>, devendo estar concluída até a data da entrega das chaves e imissão na posse.</w:t>
       </w:r>
     </w:p>
     <w:p>

</xml_diff>